<commit_message>
Add LMK print templates
</commit_message>
<xml_diff>
--- a/assets/templates/Templates/ЛМК_справка_шаблон.docx
+++ b/assets/templates/Templates/ЛМК_справка_шаблон.docx
@@ -1,6 +1,6 @@
 
 <file path=word/document.xml><?xml version="1.0" encoding="utf-8"?>
-<w:document xmlns:ns1="http://schemas.openxmlformats.org/markup-compatibility/2006" xmlns:ns2="http://schemas.microsoft.com/office/word/2010/wordml" xmlns:w="http://schemas.openxmlformats.org/wordprocessingml/2006/main" ns1:Ignorable="w14 w15 w16se w16cid w16 w16cex w16sdtdh wp14">
+<w:document xmlns:wpc="http://schemas.microsoft.com/office/word/2010/wordprocessingCanvas" xmlns:cx="http://schemas.microsoft.com/office/drawing/2014/chartex" xmlns:cx1="http://schemas.microsoft.com/office/drawing/2015/9/8/chartex" xmlns:cx2="http://schemas.microsoft.com/office/drawing/2015/10/21/chartex" xmlns:cx3="http://schemas.microsoft.com/office/drawing/2016/5/9/chartex" xmlns:cx4="http://schemas.microsoft.com/office/drawing/2016/5/10/chartex" xmlns:cx5="http://schemas.microsoft.com/office/drawing/2016/5/11/chartex" xmlns:cx6="http://schemas.microsoft.com/office/drawing/2016/5/12/chartex" xmlns:cx7="http://schemas.microsoft.com/office/drawing/2016/5/13/chartex" xmlns:cx8="http://schemas.microsoft.com/office/drawing/2016/5/14/chartex" xmlns:mc="http://schemas.openxmlformats.org/markup-compatibility/2006" xmlns:aink="http://schemas.microsoft.com/office/drawing/2016/ink" xmlns:am3d="http://schemas.microsoft.com/office/drawing/2017/model3d" xmlns:o="urn:schemas-microsoft-com:office:office" xmlns:r="http://schemas.openxmlformats.org/officeDocument/2006/relationships" xmlns:m="http://schemas.openxmlformats.org/officeDocument/2006/math" xmlns:v="urn:schemas-microsoft-com:vml" xmlns:wp14="http://schemas.microsoft.com/office/word/2010/wordprocessingDrawing" xmlns:wp="http://schemas.openxmlformats.org/drawingml/2006/wordprocessingDrawing" xmlns:w10="urn:schemas-microsoft-com:office:word" xmlns:w="http://schemas.openxmlformats.org/wordprocessingml/2006/main" xmlns:w14="http://schemas.microsoft.com/office/word/2010/wordml" xmlns:w15="http://schemas.microsoft.com/office/word/2012/wordml" xmlns:w16cex="http://schemas.microsoft.com/office/word/2018/wordml/cex" xmlns:w16cid="http://schemas.microsoft.com/office/word/2016/wordml/cid" xmlns:w16="http://schemas.microsoft.com/office/word/2018/wordml" xmlns:w16sdtdh="http://schemas.microsoft.com/office/word/2020/wordml/sdtdatahash" xmlns:w16se="http://schemas.microsoft.com/office/word/2015/wordml/symex" xmlns:wpg="http://schemas.microsoft.com/office/word/2010/wordprocessingGroup" xmlns:wpi="http://schemas.microsoft.com/office/word/2010/wordprocessingInk" xmlns:wne="http://schemas.microsoft.com/office/word/2006/wordml" xmlns:wps="http://schemas.microsoft.com/office/word/2010/wordprocessingShape" mc:Ignorable="w14 w15 w16se w16cid w16 w16cex w16sdtdh wp14">
   <w:body>
     <w:tbl>
       <w:tblPr>
@@ -12,7 +12,7 @@
       <w:tblGrid>
         <w:gridCol w:w="4783"/>
       </w:tblGrid>
-      <w:tr ns2:paraId="6A646640" ns2:textId="77777777">
+      <w:tr>
         <w:trPr>
           <w:trHeight w:val="612"/>
         </w:trPr>
@@ -29,7 +29,7 @@
             <w:vAlign w:val="center"/>
             <w:hideMark/>
           </w:tcPr>
-          <w:p ns2:paraId="5C54A32B" ns2:textId="77777777">
+          <w:p>
             <w:pPr>
               <w:shd w:val="clear" w:color="auto" w:fill="FFFFFF"/>
               <w:spacing w:before="100" w:beforeAutospacing="1" w:after="100" w:afterAutospacing="1" w:line="240" w:lineRule="auto"/>
@@ -53,7 +53,7 @@
               <w:t>ООО "Мед-Авто" 195213, СПб,</w:t>
             </w:r>
           </w:p>
-          <w:p ns2:paraId="360497E4" ns2:textId="77777777">
+          <w:p>
             <w:pPr>
               <w:shd w:val="clear" w:color="auto" w:fill="FFFFFF"/>
               <w:spacing w:before="100" w:beforeAutospacing="1" w:after="100" w:afterAutospacing="1" w:line="240" w:lineRule="auto"/>
@@ -126,7 +126,7 @@
               <w:t>ОГРН  1097847096830 серия ЛО-41 № 01148 Лиц.№78/00563298 от 22.11.2013</w:t>
             </w:r>
           </w:p>
-          <w:p ns2:paraId="6943D58D" ns2:textId="77777777">
+          <w:p>
             <w:pPr>
               <w:shd w:val="clear" w:color="auto" w:fill="FFFFFF"/>
               <w:spacing w:before="100" w:beforeAutospacing="1" w:after="100" w:afterAutospacing="1" w:line="240" w:lineRule="auto"/>
@@ -152,7 +152,7 @@
           </w:p>
         </w:tc>
       </w:tr>
-      <w:tr ns2:paraId="0BF0E692" ns2:textId="77777777">
+      <w:tr>
         <w:trPr>
           <w:trHeight w:val="612"/>
         </w:trPr>
@@ -169,7 +169,7 @@
             <w:vAlign w:val="center"/>
             <w:hideMark/>
           </w:tcPr>
-          <w:p ns2:paraId="28B391E6" ns2:textId="77777777">
+          <w:p>
             <w:pPr>
               <w:shd w:val="clear" w:color="auto" w:fill="FFFFFF"/>
               <w:spacing w:before="100" w:beforeAutospacing="1" w:after="100" w:afterAutospacing="1" w:line="240" w:lineRule="auto"/>
@@ -186,7 +186,7 @@
         </w:tc>
       </w:tr>
     </w:tbl>
-    <w:p ns2:paraId="0413AA17" ns2:textId="77777777">
+    <w:p>
       <w:pPr>
         <w:pBdr>
           <w:bottom w:val="single" w:sz="4" w:space="1" w:color="auto"/>
@@ -198,7 +198,7 @@
         </w:rPr>
       </w:pPr>
     </w:p>
-    <w:p ns2:paraId="60D166B3" ns2:textId="77777777">
+    <w:p>
       <w:pPr>
         <w:pBdr>
           <w:bottom w:val="single" w:sz="4" w:space="1" w:color="auto"/>
@@ -210,7 +210,7 @@
         </w:rPr>
       </w:pPr>
     </w:p>
-    <w:p ns2:paraId="1568F62C" ns2:textId="77777777">
+    <w:p>
       <w:pPr>
         <w:pBdr>
           <w:bottom w:val="single" w:sz="4" w:space="1" w:color="auto"/>
@@ -222,7 +222,7 @@
         </w:rPr>
       </w:pPr>
     </w:p>
-    <w:p ns2:paraId="14202F32" ns2:textId="0445D6AE">
+    <w:p>
       <w:pPr>
         <w:pBdr>
           <w:bottom w:val="single" w:sz="4" w:space="1" w:color="auto"/>
@@ -247,7 +247,6 @@
           <w:sz w:val="28"/>
           <w:szCs w:val="28"/>
         </w:rPr>
-        <w:t xml:space="preserve"/>
       </w:r>
       <w:proofErr w:type="spellStart"/>
       <w:r>
@@ -256,7 +255,6 @@
           <w:sz w:val="28"/>
           <w:szCs w:val="28"/>
         </w:rPr>
-        <w:t/>
       </w:r>
       <w:proofErr w:type="spellEnd"/>
       <w:r>
@@ -265,10 +263,9 @@
           <w:sz w:val="28"/>
           <w:szCs w:val="28"/>
         </w:rPr>
-        <w:t xml:space="preserve"/>
       </w:r>
     </w:p>
-    <w:p ns2:paraId="31BF42D8" ns2:textId="4C37F3D6">
+    <w:p>
       <w:pPr>
         <w:pBdr>
           <w:bottom w:val="single" w:sz="4" w:space="1" w:color="auto"/>
@@ -293,18 +290,16 @@
           <w:sz w:val="28"/>
           <w:szCs w:val="28"/>
         </w:rPr>
-        <w:t xml:space="preserve"/>
-      </w:r>
-      <w:r>
-        <w:rPr>
-          <w:b/>
-          <w:sz w:val="28"/>
-          <w:szCs w:val="28"/>
-        </w:rPr>
-        <w:t/>
+      </w:r>
+      <w:r>
+        <w:rPr>
+          <w:b/>
+          <w:sz w:val="28"/>
+          <w:szCs w:val="28"/>
+        </w:rPr>
       </w:r>
     </w:p>
-    <w:p ns2:paraId="11741C5B" ns2:textId="178BDCBC">
+    <w:p>
       <w:pPr>
         <w:pBdr>
           <w:bottom w:val="single" w:sz="4" w:space="1" w:color="auto"/>
@@ -330,23 +325,20 @@
           <w:sz w:val="28"/>
           <w:szCs w:val="28"/>
         </w:rPr>
-        <w:t/>
-      </w:r>
-      <w:r>
-        <w:rPr>
-          <w:b/>
-          <w:sz w:val="28"/>
-          <w:szCs w:val="28"/>
-        </w:rPr>
-        <w:t xml:space="preserve"/>
-      </w:r>
-      <w:r>
-        <w:rPr>
-          <w:b/>
-          <w:sz w:val="28"/>
-          <w:szCs w:val="28"/>
-        </w:rPr>
-        <w:t/>
+      </w:r>
+      <w:r>
+        <w:rPr>
+          <w:b/>
+          <w:sz w:val="28"/>
+          <w:szCs w:val="28"/>
+        </w:rPr>
+      </w:r>
+      <w:r>
+        <w:rPr>
+          <w:b/>
+          <w:sz w:val="28"/>
+          <w:szCs w:val="28"/>
+        </w:rPr>
       </w:r>
       <w:proofErr w:type="gramEnd"/>
       <w:r>
@@ -355,7 +347,6 @@
           <w:sz w:val="28"/>
           <w:szCs w:val="28"/>
         </w:rPr>
-        <w:t xml:space="preserve"/>
       </w:r>
       <w:proofErr w:type="spellStart"/>
       <w:r>
@@ -364,7 +355,6 @@
           <w:sz w:val="28"/>
           <w:szCs w:val="28"/>
         </w:rPr>
-        <w:t/>
       </w:r>
       <w:proofErr w:type="spellEnd"/>
       <w:r>
@@ -373,10 +363,9 @@
           <w:sz w:val="28"/>
           <w:szCs w:val="28"/>
         </w:rPr>
-        <w:t/>
       </w:r>
     </w:p>
-    <w:p ns2:paraId="3F8942B5" ns2:textId="77777777">
+    <w:p>
       <w:pPr>
         <w:pBdr>
           <w:bottom w:val="single" w:sz="4" w:space="1" w:color="auto"/>
@@ -388,7 +377,7 @@
         </w:rPr>
       </w:pPr>
     </w:p>
-    <w:p ns2:paraId="2E709844" ns2:textId="0AC832F4">
+    <w:p>
       <w:pPr>
         <w:spacing w:after="0"/>
         <w:rPr>
@@ -406,7 +395,7 @@
         <w:t>Медицинская книжка находится на оформлении.</w:t>
       </w:r>
     </w:p>
-    <w:p ns2:paraId="308E2DF0" ns2:textId="77777777">
+    <w:p>
       <w:pPr>
         <w:spacing w:after="0"/>
         <w:rPr>
@@ -424,7 +413,7 @@
         <w:t>Анализы сданы.</w:t>
       </w:r>
     </w:p>
-    <w:p ns2:paraId="598523BB" ns2:textId="77777777">
+    <w:p>
       <w:pPr>
         <w:spacing w:after="0"/>
         <w:rPr>
@@ -442,7 +431,7 @@
         <w:t>Специалисты пройдены.</w:t>
       </w:r>
     </w:p>
-    <w:p ns2:paraId="63B8AB14" ns2:textId="77777777">
+    <w:p>
       <w:pPr>
         <w:rPr>
           <w:b/>
@@ -459,7 +448,7 @@
         <w:t>К РАБОТЕ ДОПУЩЕН.</w:t>
       </w:r>
     </w:p>
-    <w:p ns2:paraId="3E87F88E" ns2:textId="3C12291E">
+    <w:p>
       <w:pPr>
         <w:rPr>
           <w:b/>
@@ -473,79 +462,70 @@
           <w:sz w:val="24"/>
           <w:szCs w:val="24"/>
         </w:rPr>
-        <w:t xml:space="preserve">М.П                                                 Врач: [Doctor]      Дата: [PrintDateTime] г.</w:t>
-      </w:r>
-      <w:r>
-        <w:rPr>
-          <w:b/>
-          <w:sz w:val="24"/>
-          <w:szCs w:val="24"/>
-        </w:rPr>
-        <w:t xml:space="preserve"/>
-      </w:r>
-      <w:r>
-        <w:rPr>
-          <w:b/>
-          <w:sz w:val="24"/>
-          <w:szCs w:val="24"/>
-        </w:rPr>
-        <w:t xml:space="preserve"/>
-      </w:r>
-      <w:r>
-        <w:rPr>
-          <w:b/>
-          <w:sz w:val="24"/>
-          <w:szCs w:val="24"/>
-        </w:rPr>
-        <w:t xml:space="preserve"/>
-      </w:r>
-      <w:r>
-        <w:rPr>
-          <w:b/>
-          <w:sz w:val="24"/>
-          <w:szCs w:val="24"/>
-        </w:rPr>
-        <w:t xml:space="preserve"/>
-      </w:r>
-      <w:r>
-        <w:rPr>
-          <w:b/>
-          <w:sz w:val="24"/>
-          <w:szCs w:val="24"/>
-        </w:rPr>
-        <w:t xml:space="preserve"/>
-      </w:r>
-      <w:r>
-        <w:rPr>
-          <w:b/>
-          <w:sz w:val="24"/>
-          <w:szCs w:val="24"/>
-        </w:rPr>
-        <w:t xml:space="preserve"/>
-      </w:r>
-      <w:r>
-        <w:rPr>
-          <w:b/>
-          <w:sz w:val="24"/>
-          <w:szCs w:val="24"/>
-        </w:rPr>
-        <w:t/>
-      </w:r>
-      <w:r>
-        <w:rPr>
-          <w:b/>
-          <w:sz w:val="24"/>
-          <w:szCs w:val="24"/>
-        </w:rPr>
-        <w:t xml:space="preserve"/>
-      </w:r>
-      <w:r>
-        <w:rPr>
-          <w:b/>
-          <w:sz w:val="24"/>
-          <w:szCs w:val="24"/>
-        </w:rPr>
-        <w:t/>
+        <w:t>М.П                                                 Врач: [Doctor]      Дата: [PrintDateTime] г.</w:t>
+      </w:r>
+      <w:r>
+        <w:rPr>
+          <w:b/>
+          <w:sz w:val="24"/>
+          <w:szCs w:val="24"/>
+        </w:rPr>
+      </w:r>
+      <w:r>
+        <w:rPr>
+          <w:b/>
+          <w:sz w:val="24"/>
+          <w:szCs w:val="24"/>
+        </w:rPr>
+      </w:r>
+      <w:r>
+        <w:rPr>
+          <w:b/>
+          <w:sz w:val="24"/>
+          <w:szCs w:val="24"/>
+        </w:rPr>
+      </w:r>
+      <w:r>
+        <w:rPr>
+          <w:b/>
+          <w:sz w:val="24"/>
+          <w:szCs w:val="24"/>
+        </w:rPr>
+      </w:r>
+      <w:r>
+        <w:rPr>
+          <w:b/>
+          <w:sz w:val="24"/>
+          <w:szCs w:val="24"/>
+        </w:rPr>
+      </w:r>
+      <w:r>
+        <w:rPr>
+          <w:b/>
+          <w:sz w:val="24"/>
+          <w:szCs w:val="24"/>
+        </w:rPr>
+      </w:r>
+      <w:r>
+        <w:rPr>
+          <w:b/>
+          <w:sz w:val="24"/>
+          <w:szCs w:val="24"/>
+        </w:rPr>
+      </w:r>
+      <w:r>
+        <w:rPr>
+          <w:b/>
+          <w:sz w:val="24"/>
+          <w:szCs w:val="24"/>
+        </w:rPr>
+      </w:r>
+      <w:r>
+        <w:rPr>
+          <w:b/>
+          <w:sz w:val="24"/>
+          <w:szCs w:val="24"/>
+        </w:rPr>
       </w:r>
     </w:p>
     <w:sectPr>

</xml_diff>

<commit_message>
Fix LMK blank type selection
</commit_message>
<xml_diff>
--- a/assets/templates/Templates/ЛМК_справка_шаблон.docx
+++ b/assets/templates/Templates/ЛМК_справка_шаблон.docx
@@ -1,6 +1,6 @@
 
 <file path=word/document.xml><?xml version="1.0" encoding="utf-8"?>
-<w:document xmlns:wpc="http://schemas.microsoft.com/office/word/2010/wordprocessingCanvas" xmlns:cx="http://schemas.microsoft.com/office/drawing/2014/chartex" xmlns:cx1="http://schemas.microsoft.com/office/drawing/2015/9/8/chartex" xmlns:cx2="http://schemas.microsoft.com/office/drawing/2015/10/21/chartex" xmlns:cx3="http://schemas.microsoft.com/office/drawing/2016/5/9/chartex" xmlns:cx4="http://schemas.microsoft.com/office/drawing/2016/5/10/chartex" xmlns:cx5="http://schemas.microsoft.com/office/drawing/2016/5/11/chartex" xmlns:cx6="http://schemas.microsoft.com/office/drawing/2016/5/12/chartex" xmlns:cx7="http://schemas.microsoft.com/office/drawing/2016/5/13/chartex" xmlns:cx8="http://schemas.microsoft.com/office/drawing/2016/5/14/chartex" xmlns:mc="http://schemas.openxmlformats.org/markup-compatibility/2006" xmlns:aink="http://schemas.microsoft.com/office/drawing/2016/ink" xmlns:am3d="http://schemas.microsoft.com/office/drawing/2017/model3d" xmlns:o="urn:schemas-microsoft-com:office:office" xmlns:r="http://schemas.openxmlformats.org/officeDocument/2006/relationships" xmlns:m="http://schemas.openxmlformats.org/officeDocument/2006/math" xmlns:v="urn:schemas-microsoft-com:vml" xmlns:wp14="http://schemas.microsoft.com/office/word/2010/wordprocessingDrawing" xmlns:wp="http://schemas.openxmlformats.org/drawingml/2006/wordprocessingDrawing" xmlns:w10="urn:schemas-microsoft-com:office:word" xmlns:w="http://schemas.openxmlformats.org/wordprocessingml/2006/main" xmlns:w14="http://schemas.microsoft.com/office/word/2010/wordml" xmlns:w15="http://schemas.microsoft.com/office/word/2012/wordml" xmlns:w16cex="http://schemas.microsoft.com/office/word/2018/wordml/cex" xmlns:w16cid="http://schemas.microsoft.com/office/word/2016/wordml/cid" xmlns:w16="http://schemas.microsoft.com/office/word/2018/wordml" xmlns:w16sdtdh="http://schemas.microsoft.com/office/word/2020/wordml/sdtdatahash" xmlns:w16se="http://schemas.microsoft.com/office/word/2015/wordml/symex" xmlns:wpg="http://schemas.microsoft.com/office/word/2010/wordprocessingGroup" xmlns:wpi="http://schemas.microsoft.com/office/word/2010/wordprocessingInk" xmlns:wne="http://schemas.microsoft.com/office/word/2006/wordml" xmlns:wps="http://schemas.microsoft.com/office/word/2010/wordprocessingShape" mc:Ignorable="w14 w15 w16se w16cid w16 w16cex w16sdtdh wp14">
+<w:document xmlns:ns1="http://schemas.openxmlformats.org/markup-compatibility/2006" xmlns:ns2="http://schemas.microsoft.com/office/word/2010/wordml" xmlns:w="http://schemas.openxmlformats.org/wordprocessingml/2006/main" ns1:Ignorable="w14 w15 w16se w16cid w16 w16cex w16sdtdh wp14">
   <w:body>
     <w:tbl>
       <w:tblPr>
@@ -12,7 +12,7 @@
       <w:tblGrid>
         <w:gridCol w:w="4783"/>
       </w:tblGrid>
-      <w:tr>
+      <w:tr ns2:paraId="6A646640" ns2:textId="77777777">
         <w:trPr>
           <w:trHeight w:val="612"/>
         </w:trPr>
@@ -29,7 +29,7 @@
             <w:vAlign w:val="center"/>
             <w:hideMark/>
           </w:tcPr>
-          <w:p>
+          <w:p ns2:paraId="5C54A32B" ns2:textId="77777777">
             <w:pPr>
               <w:shd w:val="clear" w:color="auto" w:fill="FFFFFF"/>
               <w:spacing w:before="100" w:beforeAutospacing="1" w:after="100" w:afterAutospacing="1" w:line="240" w:lineRule="auto"/>
@@ -53,7 +53,7 @@
               <w:t>ООО "Мед-Авто" 195213, СПб,</w:t>
             </w:r>
           </w:p>
-          <w:p>
+          <w:p ns2:paraId="360497E4" ns2:textId="77777777">
             <w:pPr>
               <w:shd w:val="clear" w:color="auto" w:fill="FFFFFF"/>
               <w:spacing w:before="100" w:beforeAutospacing="1" w:after="100" w:afterAutospacing="1" w:line="240" w:lineRule="auto"/>
@@ -126,7 +126,7 @@
               <w:t>ОГРН  1097847096830 серия ЛО-41 № 01148 Лиц.№78/00563298 от 22.11.2013</w:t>
             </w:r>
           </w:p>
-          <w:p>
+          <w:p ns2:paraId="6943D58D" ns2:textId="77777777">
             <w:pPr>
               <w:shd w:val="clear" w:color="auto" w:fill="FFFFFF"/>
               <w:spacing w:before="100" w:beforeAutospacing="1" w:after="100" w:afterAutospacing="1" w:line="240" w:lineRule="auto"/>
@@ -152,7 +152,7 @@
           </w:p>
         </w:tc>
       </w:tr>
-      <w:tr>
+      <w:tr ns2:paraId="0BF0E692" ns2:textId="77777777">
         <w:trPr>
           <w:trHeight w:val="612"/>
         </w:trPr>
@@ -169,7 +169,7 @@
             <w:vAlign w:val="center"/>
             <w:hideMark/>
           </w:tcPr>
-          <w:p>
+          <w:p ns2:paraId="28B391E6" ns2:textId="77777777">
             <w:pPr>
               <w:shd w:val="clear" w:color="auto" w:fill="FFFFFF"/>
               <w:spacing w:before="100" w:beforeAutospacing="1" w:after="100" w:afterAutospacing="1" w:line="240" w:lineRule="auto"/>
@@ -186,7 +186,7 @@
         </w:tc>
       </w:tr>
     </w:tbl>
-    <w:p>
+    <w:p ns2:paraId="0413AA17" ns2:textId="77777777">
       <w:pPr>
         <w:pBdr>
           <w:bottom w:val="single" w:sz="4" w:space="1" w:color="auto"/>
@@ -198,7 +198,7 @@
         </w:rPr>
       </w:pPr>
     </w:p>
-    <w:p>
+    <w:p ns2:paraId="60D166B3" ns2:textId="77777777">
       <w:pPr>
         <w:pBdr>
           <w:bottom w:val="single" w:sz="4" w:space="1" w:color="auto"/>
@@ -210,7 +210,7 @@
         </w:rPr>
       </w:pPr>
     </w:p>
-    <w:p>
+    <w:p ns2:paraId="1568F62C" ns2:textId="77777777">
       <w:pPr>
         <w:pBdr>
           <w:bottom w:val="single" w:sz="4" w:space="1" w:color="auto"/>
@@ -222,7 +222,7 @@
         </w:rPr>
       </w:pPr>
     </w:p>
-    <w:p>
+    <w:p ns2:paraId="14202F32" ns2:textId="0445D6AE">
       <w:pPr>
         <w:pBdr>
           <w:bottom w:val="single" w:sz="4" w:space="1" w:color="auto"/>
@@ -247,6 +247,7 @@
           <w:sz w:val="28"/>
           <w:szCs w:val="28"/>
         </w:rPr>
+        <w:t xml:space="preserve"/>
       </w:r>
       <w:proofErr w:type="spellStart"/>
       <w:r>
@@ -255,6 +256,7 @@
           <w:sz w:val="28"/>
           <w:szCs w:val="28"/>
         </w:rPr>
+        <w:t/>
       </w:r>
       <w:proofErr w:type="spellEnd"/>
       <w:r>
@@ -263,9 +265,10 @@
           <w:sz w:val="28"/>
           <w:szCs w:val="28"/>
         </w:rPr>
+        <w:t xml:space="preserve"/>
       </w:r>
     </w:p>
-    <w:p>
+    <w:p ns2:paraId="31BF42D8" ns2:textId="4C37F3D6">
       <w:pPr>
         <w:pBdr>
           <w:bottom w:val="single" w:sz="4" w:space="1" w:color="auto"/>
@@ -290,16 +293,18 @@
           <w:sz w:val="28"/>
           <w:szCs w:val="28"/>
         </w:rPr>
-      </w:r>
-      <w:r>
-        <w:rPr>
-          <w:b/>
-          <w:sz w:val="28"/>
-          <w:szCs w:val="28"/>
-        </w:rPr>
+        <w:t xml:space="preserve"/>
+      </w:r>
+      <w:r>
+        <w:rPr>
+          <w:b/>
+          <w:sz w:val="28"/>
+          <w:szCs w:val="28"/>
+        </w:rPr>
+        <w:t/>
       </w:r>
     </w:p>
-    <w:p>
+    <w:p ns2:paraId="11741C5B" ns2:textId="178BDCBC">
       <w:pPr>
         <w:pBdr>
           <w:bottom w:val="single" w:sz="4" w:space="1" w:color="auto"/>
@@ -325,20 +330,23 @@
           <w:sz w:val="28"/>
           <w:szCs w:val="28"/>
         </w:rPr>
-      </w:r>
-      <w:r>
-        <w:rPr>
-          <w:b/>
-          <w:sz w:val="28"/>
-          <w:szCs w:val="28"/>
-        </w:rPr>
-      </w:r>
-      <w:r>
-        <w:rPr>
-          <w:b/>
-          <w:sz w:val="28"/>
-          <w:szCs w:val="28"/>
-        </w:rPr>
+        <w:t/>
+      </w:r>
+      <w:r>
+        <w:rPr>
+          <w:b/>
+          <w:sz w:val="28"/>
+          <w:szCs w:val="28"/>
+        </w:rPr>
+        <w:t xml:space="preserve"/>
+      </w:r>
+      <w:r>
+        <w:rPr>
+          <w:b/>
+          <w:sz w:val="28"/>
+          <w:szCs w:val="28"/>
+        </w:rPr>
+        <w:t/>
       </w:r>
       <w:proofErr w:type="gramEnd"/>
       <w:r>
@@ -347,6 +355,7 @@
           <w:sz w:val="28"/>
           <w:szCs w:val="28"/>
         </w:rPr>
+        <w:t xml:space="preserve"/>
       </w:r>
       <w:proofErr w:type="spellStart"/>
       <w:r>
@@ -355,6 +364,7 @@
           <w:sz w:val="28"/>
           <w:szCs w:val="28"/>
         </w:rPr>
+        <w:t/>
       </w:r>
       <w:proofErr w:type="spellEnd"/>
       <w:r>
@@ -363,9 +373,10 @@
           <w:sz w:val="28"/>
           <w:szCs w:val="28"/>
         </w:rPr>
+        <w:t/>
       </w:r>
     </w:p>
-    <w:p>
+    <w:p ns2:paraId="3F8942B5" ns2:textId="77777777">
       <w:pPr>
         <w:pBdr>
           <w:bottom w:val="single" w:sz="4" w:space="1" w:color="auto"/>
@@ -377,7 +388,7 @@
         </w:rPr>
       </w:pPr>
     </w:p>
-    <w:p>
+    <w:p ns2:paraId="2E709844" ns2:textId="0AC832F4">
       <w:pPr>
         <w:spacing w:after="0"/>
         <w:rPr>
@@ -395,7 +406,7 @@
         <w:t>Медицинская книжка находится на оформлении.</w:t>
       </w:r>
     </w:p>
-    <w:p>
+    <w:p ns2:paraId="308E2DF0" ns2:textId="77777777">
       <w:pPr>
         <w:spacing w:after="0"/>
         <w:rPr>
@@ -413,7 +424,7 @@
         <w:t>Анализы сданы.</w:t>
       </w:r>
     </w:p>
-    <w:p>
+    <w:p ns2:paraId="598523BB" ns2:textId="77777777">
       <w:pPr>
         <w:spacing w:after="0"/>
         <w:rPr>
@@ -431,7 +442,7 @@
         <w:t>Специалисты пройдены.</w:t>
       </w:r>
     </w:p>
-    <w:p>
+    <w:p ns2:paraId="63B8AB14" ns2:textId="77777777">
       <w:pPr>
         <w:rPr>
           <w:b/>
@@ -448,7 +459,7 @@
         <w:t>К РАБОТЕ ДОПУЩЕН.</w:t>
       </w:r>
     </w:p>
-    <w:p>
+    <w:p ns2:paraId="3E87F88E" ns2:textId="3C12291E">
       <w:pPr>
         <w:rPr>
           <w:b/>
@@ -462,70 +473,79 @@
           <w:sz w:val="24"/>
           <w:szCs w:val="24"/>
         </w:rPr>
-        <w:t>М.П                                                 Врач: [Doctor]      Дата: [PrintDateTime] г.</w:t>
-      </w:r>
-      <w:r>
-        <w:rPr>
-          <w:b/>
-          <w:sz w:val="24"/>
-          <w:szCs w:val="24"/>
-        </w:rPr>
-      </w:r>
-      <w:r>
-        <w:rPr>
-          <w:b/>
-          <w:sz w:val="24"/>
-          <w:szCs w:val="24"/>
-        </w:rPr>
-      </w:r>
-      <w:r>
-        <w:rPr>
-          <w:b/>
-          <w:sz w:val="24"/>
-          <w:szCs w:val="24"/>
-        </w:rPr>
-      </w:r>
-      <w:r>
-        <w:rPr>
-          <w:b/>
-          <w:sz w:val="24"/>
-          <w:szCs w:val="24"/>
-        </w:rPr>
-      </w:r>
-      <w:r>
-        <w:rPr>
-          <w:b/>
-          <w:sz w:val="24"/>
-          <w:szCs w:val="24"/>
-        </w:rPr>
-      </w:r>
-      <w:r>
-        <w:rPr>
-          <w:b/>
-          <w:sz w:val="24"/>
-          <w:szCs w:val="24"/>
-        </w:rPr>
-      </w:r>
-      <w:r>
-        <w:rPr>
-          <w:b/>
-          <w:sz w:val="24"/>
-          <w:szCs w:val="24"/>
-        </w:rPr>
-      </w:r>
-      <w:r>
-        <w:rPr>
-          <w:b/>
-          <w:sz w:val="24"/>
-          <w:szCs w:val="24"/>
-        </w:rPr>
-      </w:r>
-      <w:r>
-        <w:rPr>
-          <w:b/>
-          <w:sz w:val="24"/>
-          <w:szCs w:val="24"/>
-        </w:rPr>
+        <w:t xml:space="preserve">М.П                                                 Врач: [Doctor]      Дата: [PrintDateTime] г.</w:t>
+      </w:r>
+      <w:r>
+        <w:rPr>
+          <w:b/>
+          <w:sz w:val="24"/>
+          <w:szCs w:val="24"/>
+        </w:rPr>
+        <w:t xml:space="preserve"/>
+      </w:r>
+      <w:r>
+        <w:rPr>
+          <w:b/>
+          <w:sz w:val="24"/>
+          <w:szCs w:val="24"/>
+        </w:rPr>
+        <w:t xml:space="preserve"/>
+      </w:r>
+      <w:r>
+        <w:rPr>
+          <w:b/>
+          <w:sz w:val="24"/>
+          <w:szCs w:val="24"/>
+        </w:rPr>
+        <w:t xml:space="preserve"/>
+      </w:r>
+      <w:r>
+        <w:rPr>
+          <w:b/>
+          <w:sz w:val="24"/>
+          <w:szCs w:val="24"/>
+        </w:rPr>
+        <w:t xml:space="preserve"/>
+      </w:r>
+      <w:r>
+        <w:rPr>
+          <w:b/>
+          <w:sz w:val="24"/>
+          <w:szCs w:val="24"/>
+        </w:rPr>
+        <w:t xml:space="preserve"/>
+      </w:r>
+      <w:r>
+        <w:rPr>
+          <w:b/>
+          <w:sz w:val="24"/>
+          <w:szCs w:val="24"/>
+        </w:rPr>
+        <w:t xml:space="preserve"/>
+      </w:r>
+      <w:r>
+        <w:rPr>
+          <w:b/>
+          <w:sz w:val="24"/>
+          <w:szCs w:val="24"/>
+        </w:rPr>
+        <w:t/>
+      </w:r>
+      <w:r>
+        <w:rPr>
+          <w:b/>
+          <w:sz w:val="24"/>
+          <w:szCs w:val="24"/>
+        </w:rPr>
+        <w:t xml:space="preserve"/>
+      </w:r>
+      <w:r>
+        <w:rPr>
+          <w:b/>
+          <w:sz w:val="24"/>
+          <w:szCs w:val="24"/>
+        </w:rPr>
+        <w:t/>
       </w:r>
     </w:p>
     <w:sectPr>

</xml_diff>

<commit_message>
Complete LMK printing workflow
</commit_message>
<xml_diff>
--- a/assets/templates/Templates/ЛМК_справка_шаблон.docx
+++ b/assets/templates/Templates/ЛМК_справка_шаблон.docx
@@ -1,6 +1,6 @@
 
 <file path=word/document.xml><?xml version="1.0" encoding="utf-8"?>
-<w:document xmlns:ns1="http://schemas.openxmlformats.org/markup-compatibility/2006" xmlns:ns2="http://schemas.microsoft.com/office/word/2010/wordml" xmlns:w="http://schemas.openxmlformats.org/wordprocessingml/2006/main" ns1:Ignorable="w14 w15 w16se w16cid w16 w16cex w16sdtdh wp14">
+<w:document xmlns:wpc="http://schemas.microsoft.com/office/word/2010/wordprocessingCanvas" xmlns:cx="http://schemas.microsoft.com/office/drawing/2014/chartex" xmlns:cx1="http://schemas.microsoft.com/office/drawing/2015/9/8/chartex" xmlns:cx2="http://schemas.microsoft.com/office/drawing/2015/10/21/chartex" xmlns:cx3="http://schemas.microsoft.com/office/drawing/2016/5/9/chartex" xmlns:cx4="http://schemas.microsoft.com/office/drawing/2016/5/10/chartex" xmlns:cx5="http://schemas.microsoft.com/office/drawing/2016/5/11/chartex" xmlns:cx6="http://schemas.microsoft.com/office/drawing/2016/5/12/chartex" xmlns:cx7="http://schemas.microsoft.com/office/drawing/2016/5/13/chartex" xmlns:cx8="http://schemas.microsoft.com/office/drawing/2016/5/14/chartex" xmlns:mc="http://schemas.openxmlformats.org/markup-compatibility/2006" xmlns:aink="http://schemas.microsoft.com/office/drawing/2016/ink" xmlns:am3d="http://schemas.microsoft.com/office/drawing/2017/model3d" xmlns:o="urn:schemas-microsoft-com:office:office" xmlns:r="http://schemas.openxmlformats.org/officeDocument/2006/relationships" xmlns:m="http://schemas.openxmlformats.org/officeDocument/2006/math" xmlns:v="urn:schemas-microsoft-com:vml" xmlns:wp14="http://schemas.microsoft.com/office/word/2010/wordprocessingDrawing" xmlns:wp="http://schemas.openxmlformats.org/drawingml/2006/wordprocessingDrawing" xmlns:w10="urn:schemas-microsoft-com:office:word" xmlns:w="http://schemas.openxmlformats.org/wordprocessingml/2006/main" xmlns:w14="http://schemas.microsoft.com/office/word/2010/wordml" xmlns:w15="http://schemas.microsoft.com/office/word/2012/wordml" xmlns:w16cex="http://schemas.microsoft.com/office/word/2018/wordml/cex" xmlns:w16cid="http://schemas.microsoft.com/office/word/2016/wordml/cid" xmlns:w16="http://schemas.microsoft.com/office/word/2018/wordml" xmlns:w16sdtdh="http://schemas.microsoft.com/office/word/2020/wordml/sdtdatahash" xmlns:w16se="http://schemas.microsoft.com/office/word/2015/wordml/symex" xmlns:wpg="http://schemas.microsoft.com/office/word/2010/wordprocessingGroup" xmlns:wpi="http://schemas.microsoft.com/office/word/2010/wordprocessingInk" xmlns:wne="http://schemas.microsoft.com/office/word/2006/wordml" xmlns:wps="http://schemas.microsoft.com/office/word/2010/wordprocessingShape" mc:Ignorable="w14 w15 w16se w16cid w16 w16cex w16sdtdh wp14">
   <w:body>
     <w:tbl>
       <w:tblPr>
@@ -12,7 +12,7 @@
       <w:tblGrid>
         <w:gridCol w:w="4783"/>
       </w:tblGrid>
-      <w:tr ns2:paraId="6A646640" ns2:textId="77777777">
+      <w:tr>
         <w:trPr>
           <w:trHeight w:val="612"/>
         </w:trPr>
@@ -29,7 +29,7 @@
             <w:vAlign w:val="center"/>
             <w:hideMark/>
           </w:tcPr>
-          <w:p ns2:paraId="5C54A32B" ns2:textId="77777777">
+          <w:p>
             <w:pPr>
               <w:shd w:val="clear" w:color="auto" w:fill="FFFFFF"/>
               <w:spacing w:before="100" w:beforeAutospacing="1" w:after="100" w:afterAutospacing="1" w:line="240" w:lineRule="auto"/>
@@ -53,7 +53,7 @@
               <w:t>ООО "Мед-Авто" 195213, СПб,</w:t>
             </w:r>
           </w:p>
-          <w:p ns2:paraId="360497E4" ns2:textId="77777777">
+          <w:p>
             <w:pPr>
               <w:shd w:val="clear" w:color="auto" w:fill="FFFFFF"/>
               <w:spacing w:before="100" w:beforeAutospacing="1" w:after="100" w:afterAutospacing="1" w:line="240" w:lineRule="auto"/>
@@ -126,7 +126,7 @@
               <w:t>ОГРН  1097847096830 серия ЛО-41 № 01148 Лиц.№78/00563298 от 22.11.2013</w:t>
             </w:r>
           </w:p>
-          <w:p ns2:paraId="6943D58D" ns2:textId="77777777">
+          <w:p>
             <w:pPr>
               <w:shd w:val="clear" w:color="auto" w:fill="FFFFFF"/>
               <w:spacing w:before="100" w:beforeAutospacing="1" w:after="100" w:afterAutospacing="1" w:line="240" w:lineRule="auto"/>
@@ -152,7 +152,7 @@
           </w:p>
         </w:tc>
       </w:tr>
-      <w:tr ns2:paraId="0BF0E692" ns2:textId="77777777">
+      <w:tr>
         <w:trPr>
           <w:trHeight w:val="612"/>
         </w:trPr>
@@ -169,7 +169,7 @@
             <w:vAlign w:val="center"/>
             <w:hideMark/>
           </w:tcPr>
-          <w:p ns2:paraId="28B391E6" ns2:textId="77777777">
+          <w:p>
             <w:pPr>
               <w:shd w:val="clear" w:color="auto" w:fill="FFFFFF"/>
               <w:spacing w:before="100" w:beforeAutospacing="1" w:after="100" w:afterAutospacing="1" w:line="240" w:lineRule="auto"/>
@@ -186,7 +186,7 @@
         </w:tc>
       </w:tr>
     </w:tbl>
-    <w:p ns2:paraId="0413AA17" ns2:textId="77777777">
+    <w:p>
       <w:pPr>
         <w:pBdr>
           <w:bottom w:val="single" w:sz="4" w:space="1" w:color="auto"/>
@@ -198,7 +198,7 @@
         </w:rPr>
       </w:pPr>
     </w:p>
-    <w:p ns2:paraId="60D166B3" ns2:textId="77777777">
+    <w:p>
       <w:pPr>
         <w:pBdr>
           <w:bottom w:val="single" w:sz="4" w:space="1" w:color="auto"/>
@@ -210,7 +210,7 @@
         </w:rPr>
       </w:pPr>
     </w:p>
-    <w:p ns2:paraId="1568F62C" ns2:textId="77777777">
+    <w:p>
       <w:pPr>
         <w:pBdr>
           <w:bottom w:val="single" w:sz="4" w:space="1" w:color="auto"/>
@@ -222,7 +222,7 @@
         </w:rPr>
       </w:pPr>
     </w:p>
-    <w:p ns2:paraId="14202F32" ns2:textId="0445D6AE">
+    <w:p>
       <w:pPr>
         <w:pBdr>
           <w:bottom w:val="single" w:sz="4" w:space="1" w:color="auto"/>
@@ -247,7 +247,6 @@
           <w:sz w:val="28"/>
           <w:szCs w:val="28"/>
         </w:rPr>
-        <w:t xml:space="preserve"/>
       </w:r>
       <w:proofErr w:type="spellStart"/>
       <w:r>
@@ -256,7 +255,6 @@
           <w:sz w:val="28"/>
           <w:szCs w:val="28"/>
         </w:rPr>
-        <w:t/>
       </w:r>
       <w:proofErr w:type="spellEnd"/>
       <w:r>
@@ -265,10 +263,9 @@
           <w:sz w:val="28"/>
           <w:szCs w:val="28"/>
         </w:rPr>
-        <w:t xml:space="preserve"/>
       </w:r>
     </w:p>
-    <w:p ns2:paraId="31BF42D8" ns2:textId="4C37F3D6">
+    <w:p>
       <w:pPr>
         <w:pBdr>
           <w:bottom w:val="single" w:sz="4" w:space="1" w:color="auto"/>
@@ -293,18 +290,16 @@
           <w:sz w:val="28"/>
           <w:szCs w:val="28"/>
         </w:rPr>
-        <w:t xml:space="preserve"/>
-      </w:r>
-      <w:r>
-        <w:rPr>
-          <w:b/>
-          <w:sz w:val="28"/>
-          <w:szCs w:val="28"/>
-        </w:rPr>
-        <w:t/>
+      </w:r>
+      <w:r>
+        <w:rPr>
+          <w:b/>
+          <w:sz w:val="28"/>
+          <w:szCs w:val="28"/>
+        </w:rPr>
       </w:r>
     </w:p>
-    <w:p ns2:paraId="11741C5B" ns2:textId="178BDCBC">
+    <w:p>
       <w:pPr>
         <w:pBdr>
           <w:bottom w:val="single" w:sz="4" w:space="1" w:color="auto"/>
@@ -330,23 +325,20 @@
           <w:sz w:val="28"/>
           <w:szCs w:val="28"/>
         </w:rPr>
-        <w:t/>
-      </w:r>
-      <w:r>
-        <w:rPr>
-          <w:b/>
-          <w:sz w:val="28"/>
-          <w:szCs w:val="28"/>
-        </w:rPr>
-        <w:t xml:space="preserve"/>
-      </w:r>
-      <w:r>
-        <w:rPr>
-          <w:b/>
-          <w:sz w:val="28"/>
-          <w:szCs w:val="28"/>
-        </w:rPr>
-        <w:t/>
+      </w:r>
+      <w:r>
+        <w:rPr>
+          <w:b/>
+          <w:sz w:val="28"/>
+          <w:szCs w:val="28"/>
+        </w:rPr>
+      </w:r>
+      <w:r>
+        <w:rPr>
+          <w:b/>
+          <w:sz w:val="28"/>
+          <w:szCs w:val="28"/>
+        </w:rPr>
       </w:r>
       <w:proofErr w:type="gramEnd"/>
       <w:r>
@@ -355,7 +347,6 @@
           <w:sz w:val="28"/>
           <w:szCs w:val="28"/>
         </w:rPr>
-        <w:t xml:space="preserve"/>
       </w:r>
       <w:proofErr w:type="spellStart"/>
       <w:r>
@@ -364,7 +355,6 @@
           <w:sz w:val="28"/>
           <w:szCs w:val="28"/>
         </w:rPr>
-        <w:t/>
       </w:r>
       <w:proofErr w:type="spellEnd"/>
       <w:r>
@@ -373,10 +363,9 @@
           <w:sz w:val="28"/>
           <w:szCs w:val="28"/>
         </w:rPr>
-        <w:t/>
       </w:r>
     </w:p>
-    <w:p ns2:paraId="3F8942B5" ns2:textId="77777777">
+    <w:p>
       <w:pPr>
         <w:pBdr>
           <w:bottom w:val="single" w:sz="4" w:space="1" w:color="auto"/>
@@ -388,7 +377,7 @@
         </w:rPr>
       </w:pPr>
     </w:p>
-    <w:p ns2:paraId="2E709844" ns2:textId="0AC832F4">
+    <w:p>
       <w:pPr>
         <w:spacing w:after="0"/>
         <w:rPr>
@@ -406,7 +395,7 @@
         <w:t>Медицинская книжка находится на оформлении.</w:t>
       </w:r>
     </w:p>
-    <w:p ns2:paraId="308E2DF0" ns2:textId="77777777">
+    <w:p>
       <w:pPr>
         <w:spacing w:after="0"/>
         <w:rPr>
@@ -424,7 +413,7 @@
         <w:t>Анализы сданы.</w:t>
       </w:r>
     </w:p>
-    <w:p ns2:paraId="598523BB" ns2:textId="77777777">
+    <w:p>
       <w:pPr>
         <w:spacing w:after="0"/>
         <w:rPr>
@@ -442,7 +431,7 @@
         <w:t>Специалисты пройдены.</w:t>
       </w:r>
     </w:p>
-    <w:p ns2:paraId="63B8AB14" ns2:textId="77777777">
+    <w:p>
       <w:pPr>
         <w:rPr>
           <w:b/>
@@ -459,7 +448,7 @@
         <w:t>К РАБОТЕ ДОПУЩЕН.</w:t>
       </w:r>
     </w:p>
-    <w:p ns2:paraId="3E87F88E" ns2:textId="3C12291E">
+    <w:p>
       <w:pPr>
         <w:rPr>
           <w:b/>
@@ -473,79 +462,70 @@
           <w:sz w:val="24"/>
           <w:szCs w:val="24"/>
         </w:rPr>
-        <w:t xml:space="preserve">М.П                                                 Врач: [Doctor]      Дата: [PrintDateTime] г.</w:t>
-      </w:r>
-      <w:r>
-        <w:rPr>
-          <w:b/>
-          <w:sz w:val="24"/>
-          <w:szCs w:val="24"/>
-        </w:rPr>
-        <w:t xml:space="preserve"/>
-      </w:r>
-      <w:r>
-        <w:rPr>
-          <w:b/>
-          <w:sz w:val="24"/>
-          <w:szCs w:val="24"/>
-        </w:rPr>
-        <w:t xml:space="preserve"/>
-      </w:r>
-      <w:r>
-        <w:rPr>
-          <w:b/>
-          <w:sz w:val="24"/>
-          <w:szCs w:val="24"/>
-        </w:rPr>
-        <w:t xml:space="preserve"/>
-      </w:r>
-      <w:r>
-        <w:rPr>
-          <w:b/>
-          <w:sz w:val="24"/>
-          <w:szCs w:val="24"/>
-        </w:rPr>
-        <w:t xml:space="preserve"/>
-      </w:r>
-      <w:r>
-        <w:rPr>
-          <w:b/>
-          <w:sz w:val="24"/>
-          <w:szCs w:val="24"/>
-        </w:rPr>
-        <w:t xml:space="preserve"/>
-      </w:r>
-      <w:r>
-        <w:rPr>
-          <w:b/>
-          <w:sz w:val="24"/>
-          <w:szCs w:val="24"/>
-        </w:rPr>
-        <w:t xml:space="preserve"/>
-      </w:r>
-      <w:r>
-        <w:rPr>
-          <w:b/>
-          <w:sz w:val="24"/>
-          <w:szCs w:val="24"/>
-        </w:rPr>
-        <w:t/>
-      </w:r>
-      <w:r>
-        <w:rPr>
-          <w:b/>
-          <w:sz w:val="24"/>
-          <w:szCs w:val="24"/>
-        </w:rPr>
-        <w:t xml:space="preserve"/>
-      </w:r>
-      <w:r>
-        <w:rPr>
-          <w:b/>
-          <w:sz w:val="24"/>
-          <w:szCs w:val="24"/>
-        </w:rPr>
-        <w:t/>
+        <w:t>М.П                                                 Врач: [Doctor]      Дата: [PrintDateTime] г.</w:t>
+      </w:r>
+      <w:r>
+        <w:rPr>
+          <w:b/>
+          <w:sz w:val="24"/>
+          <w:szCs w:val="24"/>
+        </w:rPr>
+      </w:r>
+      <w:r>
+        <w:rPr>
+          <w:b/>
+          <w:sz w:val="24"/>
+          <w:szCs w:val="24"/>
+        </w:rPr>
+      </w:r>
+      <w:r>
+        <w:rPr>
+          <w:b/>
+          <w:sz w:val="24"/>
+          <w:szCs w:val="24"/>
+        </w:rPr>
+      </w:r>
+      <w:r>
+        <w:rPr>
+          <w:b/>
+          <w:sz w:val="24"/>
+          <w:szCs w:val="24"/>
+        </w:rPr>
+      </w:r>
+      <w:r>
+        <w:rPr>
+          <w:b/>
+          <w:sz w:val="24"/>
+          <w:szCs w:val="24"/>
+        </w:rPr>
+      </w:r>
+      <w:r>
+        <w:rPr>
+          <w:b/>
+          <w:sz w:val="24"/>
+          <w:szCs w:val="24"/>
+        </w:rPr>
+      </w:r>
+      <w:r>
+        <w:rPr>
+          <w:b/>
+          <w:sz w:val="24"/>
+          <w:szCs w:val="24"/>
+        </w:rPr>
+      </w:r>
+      <w:r>
+        <w:rPr>
+          <w:b/>
+          <w:sz w:val="24"/>
+          <w:szCs w:val="24"/>
+        </w:rPr>
+      </w:r>
+      <w:r>
+        <w:rPr>
+          <w:b/>
+          <w:sz w:val="24"/>
+          <w:szCs w:val="24"/>
+        </w:rPr>
       </w:r>
     </w:p>
     <w:sectPr>

</xml_diff>

<commit_message>
Print a sequential number on the LMK certificate
Справка ЛМК печатается на чистом листе А4, поэтому номерной бланк ей
не нужен: раньше она автоматически забирала свободный бланк серии 29Н,
а на самом листе никакого номера не появлялось.

Теперь справка не расходует номерной бланк вообще, а получает простой
порядковый номер, который подставляется в документ ("Справка № N").
Повторная печать того же обращения переиспользует уже выданный номер.
Номер выдаётся как max+1 задолго до вставки строки generated_documents,
поэтому выдача сериализуется advisory-блокировкой PostgreSQL — иначе две
одновременные печати получили бы один номер.

Титульный лист ЛМК не меняется: он по-прежнему печатается на
типографском бланке серии ЛМК с заранее напечатанным номером.

Co-Authored-By: Claude Opus 5 <noreply@anthropic.com>
</commit_message>
<xml_diff>
--- a/assets/templates/Templates/ЛМК_справка_шаблон.docx
+++ b/assets/templates/Templates/ЛМК_справка_шаблон.docx
@@ -191,12 +191,21 @@
         <w:pBdr>
           <w:bottom w:val="single" w:sz="4" w:space="1" w:color="auto"/>
         </w:pBdr>
+        <w:jc w:val="right"/>
         <w:rPr>
           <w:b/>
           <w:sz w:val="28"/>
           <w:szCs w:val="28"/>
         </w:rPr>
       </w:pPr>
+      <w:r>
+        <w:rPr>
+          <w:b/>
+          <w:sz w:val="28"/>
+          <w:szCs w:val="28"/>
+        </w:rPr>
+        <w:t xml:space="preserve">Справка № [CertificateNumber]</w:t>
+      </w:r>
     </w:p>
     <w:p>
       <w:pPr>

</xml_diff>